<commit_message>
doc : Uniformisation de la police dans le rapport
</commit_message>
<xml_diff>
--- a/Rapport.docx
+++ b/Rapport.docx
@@ -4,7 +4,7 @@
   <w:body>
     <w:p>
       <w:pPr>
-        <w:pStyle w:val="Heading1"/>
+        <w:pStyle w:val="Titre1"/>
         <w:numPr>
           <w:ilvl w:val="0"/>
           <w:numId w:val="2"/>
@@ -30,7 +30,7 @@
     </w:p>
     <w:p>
       <w:pPr>
-        <w:pStyle w:val="Heading2"/>
+        <w:pStyle w:val="Titre2"/>
         <w:numPr>
           <w:ilvl w:val="1"/>
           <w:numId w:val="3"/>
@@ -47,7 +47,7 @@
     </w:p>
     <w:p>
       <w:pPr>
-        <w:pStyle w:val="ListParagraph"/>
+        <w:pStyle w:val="Paragraphedeliste"/>
         <w:numPr>
           <w:ilvl w:val="0"/>
           <w:numId w:val="4"/>
@@ -63,21 +63,12 @@
         <w:t xml:space="preserve"> : </w:t>
       </w:r>
       <w:r>
-        <w:t>Point d'entrée principal de l'application. Il regroupe les fonctions de haut niveau, l'analyseur</w:t>
-      </w:r>
-      <w:r>
-        <w:t xml:space="preserve"> </w:t>
-      </w:r>
-      <w:r>
-        <w:t>d'arguments, la logique de cryptanalyse brute-force, ainsi que les routines d'accès aux fichiers d'entrée/ sortie</w:t>
-      </w:r>
-      <w:r>
-        <w:t>.</w:t>
+        <w:t>Point d'entrée principal de l'application. Il regroupe les fonctions de haut niveau, l'analyseur d'arguments, la logique de cryptanalyse brute-force, ainsi que les routines d'accès aux fichiers d'entrée/ sortie.</w:t>
       </w:r>
     </w:p>
     <w:p>
       <w:pPr>
-        <w:pStyle w:val="ListParagraph"/>
+        <w:pStyle w:val="Paragraphedeliste"/>
         <w:numPr>
           <w:ilvl w:val="0"/>
           <w:numId w:val="4"/>
@@ -109,7 +100,7 @@
     </w:p>
     <w:p>
       <w:pPr>
-        <w:pStyle w:val="ListParagraph"/>
+        <w:pStyle w:val="Paragraphedeliste"/>
         <w:numPr>
           <w:ilvl w:val="0"/>
           <w:numId w:val="4"/>
@@ -125,24 +116,15 @@
         <w:t>message.txt</w:t>
       </w:r>
       <w:r>
-        <w:t>):</w:t>
-      </w:r>
-      <w:r>
-        <w:t xml:space="preserve"> </w:t>
-      </w:r>
-      <w:r>
-        <w:t>Fichier texte standardisé utilisé pour l'évaluation des performances sur des volumes</w:t>
-      </w:r>
-      <w:r>
-        <w:t xml:space="preserve"> </w:t>
-      </w:r>
-      <w:r>
-        <w:t>textuels représentatifs.</w:t>
+        <w:t xml:space="preserve">): </w:t>
+      </w:r>
+      <w:r>
+        <w:t>Fichier texte standardisé utilisé pour l'évaluation des performances sur des volumes textuels représentatifs.</w:t>
       </w:r>
     </w:p>
     <w:p>
       <w:pPr>
-        <w:pStyle w:val="Heading2"/>
+        <w:pStyle w:val="Titre2"/>
         <w:numPr>
           <w:ilvl w:val="1"/>
           <w:numId w:val="3"/>
@@ -162,16 +144,7 @@
       </w:r>
       <w:proofErr w:type="spellEnd"/>
       <w:r>
-        <w:t>,</w:t>
-      </w:r>
-      <w:r>
-        <w:t xml:space="preserve"> assurant une validation stricte</w:t>
-      </w:r>
-      <w:r>
-        <w:t xml:space="preserve"> </w:t>
-      </w:r>
-      <w:r>
-        <w:t>des types de paramètres appliqués. Le flux opérationnel suit une séquence déterministe :</w:t>
+        <w:t>, assurant une validation stricte des types de paramètres appliqués. Le flux opérationnel suit une séquence déterministe :</w:t>
       </w:r>
     </w:p>
     <w:p>
@@ -184,8 +157,11 @@
         <w:jc w:val="center"/>
       </w:pPr>
       <w:r>
+        <w:rPr>
+          <w:noProof/>
+        </w:rPr>
         <w:drawing>
-          <wp:inline distT="0" distB="0" distL="0" distR="0" wp14:anchorId="4BEE7AE7" wp14:editId="6FAED984">
+          <wp:inline distT="0" distB="0" distL="0" distR="0" wp14:anchorId="4BEE7AE7" wp14:editId="734D372D">
             <wp:extent cx="4657725" cy="2624176"/>
             <wp:effectExtent l="0" t="0" r="0" b="5080"/>
             <wp:docPr id="1321505531" name="Picture 1"/>
@@ -242,7 +218,7 @@
     </w:p>
     <w:p>
       <w:pPr>
-        <w:pStyle w:val="Heading1"/>
+        <w:pStyle w:val="Titre1"/>
         <w:numPr>
           <w:ilvl w:val="0"/>
           <w:numId w:val="3"/>
@@ -254,18 +230,12 @@
     </w:p>
     <w:p>
       <w:r>
-        <w:t>Conformément aux directives pédagogiques révisées, l'ensemble du traitement repose sur un principe</w:t>
-      </w:r>
-      <w:r>
-        <w:t xml:space="preserve"> </w:t>
-      </w:r>
-      <w:r>
-        <w:t>d'égalisation et de simplification de la casse : toutes les chaînes sont uniformisées en minuscules dès l'amont, éliminant ainsi la complexité inutile liée à la conservation des majuscules dans le flux de sortie.</w:t>
+        <w:t>Conformément aux directives pédagogiques révisées, l'ensemble du traitement repose sur un principe d'égalisation et de simplification de la casse : toutes les chaînes sont uniformisées en minuscules dès l'amont, éliminant ainsi la complexité inutile liée à la conservation des majuscules dans le flux de sortie.</w:t>
       </w:r>
     </w:p>
     <w:p>
       <w:pPr>
-        <w:pStyle w:val="Heading2"/>
+        <w:pStyle w:val="Titre2"/>
         <w:numPr>
           <w:ilvl w:val="1"/>
           <w:numId w:val="3"/>
@@ -288,13 +258,7 @@
       </w:r>
       <w:proofErr w:type="spellEnd"/>
       <w:r>
-        <w:t xml:space="preserve"> neutralise les interférences linguistiques (accents, diacritiques) avant</w:t>
-      </w:r>
-      <w:r>
-        <w:t xml:space="preserve"> </w:t>
-      </w:r>
-      <w:r>
-        <w:t>toute manipulation mathématique. Elle applique une décomposition de type NFKD (</w:t>
+        <w:t xml:space="preserve"> neutralise les interférences linguistiques (accents, diacritiques) avant toute manipulation mathématique. Elle applique une décomposition de type NFKD (</w:t>
       </w:r>
       <w:proofErr w:type="spellStart"/>
       <w:r>
@@ -333,43 +297,29 @@
       <w:pPr>
         <w:rPr>
           <w:rFonts w:ascii="Courier New" w:hAnsi="Courier New" w:cs="Courier New"/>
-        </w:rPr>
-      </w:pPr>
-      <w:proofErr w:type="spellStart"/>
+          <w:lang w:val="en-CA"/>
+        </w:rPr>
+      </w:pPr>
+      <w:r>
+        <w:rPr>
+          <w:rFonts w:ascii="Courier New" w:hAnsi="Courier New" w:cs="Courier New"/>
+          <w:lang w:val="en-CA"/>
+        </w:rPr>
+        <w:t xml:space="preserve">mot_normalise = </w:t>
+      </w:r>
       <w:proofErr w:type="gramStart"/>
       <w:r>
         <w:rPr>
           <w:rFonts w:ascii="Courier New" w:hAnsi="Courier New" w:cs="Courier New"/>
-        </w:rPr>
-        <w:t>mot</w:t>
+          <w:lang w:val="en-CA"/>
+        </w:rPr>
+        <w:t>unicodedata.normalize</w:t>
       </w:r>
       <w:proofErr w:type="gramEnd"/>
       <w:r>
         <w:rPr>
           <w:rFonts w:ascii="Courier New" w:hAnsi="Courier New" w:cs="Courier New"/>
-        </w:rPr>
-        <w:t>_normalise</w:t>
-      </w:r>
-      <w:proofErr w:type="spellEnd"/>
-      <w:r>
-        <w:rPr>
-          <w:rFonts w:ascii="Courier New" w:hAnsi="Courier New" w:cs="Courier New"/>
-        </w:rPr>
-        <w:t xml:space="preserve"> = </w:t>
-      </w:r>
-      <w:proofErr w:type="spellStart"/>
-      <w:proofErr w:type="gramStart"/>
-      <w:r>
-        <w:rPr>
-          <w:rFonts w:ascii="Courier New" w:hAnsi="Courier New" w:cs="Courier New"/>
-        </w:rPr>
-        <w:t>unicodedata.normalize</w:t>
-      </w:r>
-      <w:proofErr w:type="spellEnd"/>
-      <w:proofErr w:type="gramEnd"/>
-      <w:r>
-        <w:rPr>
-          <w:rFonts w:ascii="Courier New" w:hAnsi="Courier New" w:cs="Courier New"/>
+          <w:lang w:val="en-CA"/>
         </w:rPr>
         <w:t>('NFKD', message)</w:t>
       </w:r>
@@ -378,108 +328,68 @@
       <w:pPr>
         <w:rPr>
           <w:rFonts w:ascii="Courier New" w:hAnsi="Courier New" w:cs="Courier New"/>
-        </w:rPr>
-      </w:pPr>
-      <w:proofErr w:type="spellStart"/>
+          <w:lang w:val="en-CA"/>
+        </w:rPr>
+      </w:pPr>
+      <w:r>
+        <w:rPr>
+          <w:rFonts w:ascii="Courier New" w:hAnsi="Courier New" w:cs="Courier New"/>
+          <w:lang w:val="en-CA"/>
+        </w:rPr>
+        <w:t>message_propre = '</w:t>
+      </w:r>
       <w:proofErr w:type="gramStart"/>
       <w:r>
         <w:rPr>
           <w:rFonts w:ascii="Courier New" w:hAnsi="Courier New" w:cs="Courier New"/>
-        </w:rPr>
-        <w:t>message</w:t>
+          <w:lang w:val="en-CA"/>
+        </w:rPr>
+        <w:t>'.join</w:t>
       </w:r>
       <w:proofErr w:type="gramEnd"/>
       <w:r>
         <w:rPr>
           <w:rFonts w:ascii="Courier New" w:hAnsi="Courier New" w:cs="Courier New"/>
-        </w:rPr>
-        <w:t>_propre</w:t>
-      </w:r>
-      <w:proofErr w:type="spellEnd"/>
+          <w:lang w:val="en-CA"/>
+        </w:rPr>
+        <w:t xml:space="preserve">([c for c in mot_normalise if not </w:t>
+      </w:r>
+      <w:proofErr w:type="gramStart"/>
       <w:r>
         <w:rPr>
           <w:rFonts w:ascii="Courier New" w:hAnsi="Courier New" w:cs="Courier New"/>
-        </w:rPr>
-        <w:t xml:space="preserve"> = '</w:t>
+          <w:lang w:val="en-CA"/>
+        </w:rPr>
+        <w:t>unicodedata.combining</w:t>
+      </w:r>
+      <w:proofErr w:type="gramEnd"/>
+      <w:r>
+        <w:rPr>
+          <w:rFonts w:ascii="Courier New" w:hAnsi="Courier New" w:cs="Courier New"/>
+          <w:lang w:val="en-CA"/>
+        </w:rPr>
+        <w:t>(c)]</w:t>
       </w:r>
       <w:proofErr w:type="gramStart"/>
       <w:r>
         <w:rPr>
           <w:rFonts w:ascii="Courier New" w:hAnsi="Courier New" w:cs="Courier New"/>
-        </w:rPr>
-        <w:t>'.</w:t>
-      </w:r>
-      <w:proofErr w:type="spellStart"/>
+          <w:lang w:val="en-CA"/>
+        </w:rPr>
+        <w:t>).lower</w:t>
+      </w:r>
+      <w:proofErr w:type="gramEnd"/>
       <w:r>
         <w:rPr>
           <w:rFonts w:ascii="Courier New" w:hAnsi="Courier New" w:cs="Courier New"/>
-        </w:rPr>
-        <w:t>join</w:t>
-      </w:r>
-      <w:proofErr w:type="spellEnd"/>
-      <w:proofErr w:type="gramEnd"/>
-      <w:r>
-        <w:rPr>
-          <w:rFonts w:ascii="Courier New" w:hAnsi="Courier New" w:cs="Courier New"/>
-        </w:rPr>
-        <w:t xml:space="preserve">([c for c in </w:t>
-      </w:r>
-      <w:proofErr w:type="spellStart"/>
-      <w:r>
-        <w:rPr>
-          <w:rFonts w:ascii="Courier New" w:hAnsi="Courier New" w:cs="Courier New"/>
-        </w:rPr>
-        <w:t>mot_normalise</w:t>
-      </w:r>
-      <w:proofErr w:type="spellEnd"/>
-      <w:r>
-        <w:rPr>
-          <w:rFonts w:ascii="Courier New" w:hAnsi="Courier New" w:cs="Courier New"/>
-        </w:rPr>
-        <w:t xml:space="preserve"> if not </w:t>
-      </w:r>
-      <w:proofErr w:type="spellStart"/>
-      <w:proofErr w:type="gramStart"/>
-      <w:r>
-        <w:rPr>
-          <w:rFonts w:ascii="Courier New" w:hAnsi="Courier New" w:cs="Courier New"/>
-        </w:rPr>
-        <w:t>unicodedata.combining</w:t>
-      </w:r>
-      <w:proofErr w:type="spellEnd"/>
-      <w:proofErr w:type="gramEnd"/>
-      <w:r>
-        <w:rPr>
-          <w:rFonts w:ascii="Courier New" w:hAnsi="Courier New" w:cs="Courier New"/>
-        </w:rPr>
-        <w:t>(c)]</w:t>
-      </w:r>
-      <w:proofErr w:type="gramStart"/>
-      <w:r>
-        <w:rPr>
-          <w:rFonts w:ascii="Courier New" w:hAnsi="Courier New" w:cs="Courier New"/>
-        </w:rPr>
-        <w:t>).</w:t>
-      </w:r>
-      <w:proofErr w:type="spellStart"/>
-      <w:r>
-        <w:rPr>
-          <w:rFonts w:ascii="Courier New" w:hAnsi="Courier New" w:cs="Courier New"/>
-        </w:rPr>
-        <w:t>lower</w:t>
-      </w:r>
-      <w:proofErr w:type="spellEnd"/>
-      <w:proofErr w:type="gramEnd"/>
-      <w:r>
-        <w:rPr>
-          <w:rFonts w:ascii="Courier New" w:hAnsi="Courier New" w:cs="Courier New"/>
+          <w:lang w:val="en-CA"/>
         </w:rPr>
         <w:t>()</w:t>
       </w:r>
     </w:p>
     <w:p>
       <w:pPr>
-        <w:pStyle w:val="Heading2"/>
+        <w:pStyle w:val="Titre2"/>
         <w:numPr>
           <w:ilvl w:val="1"/>
           <w:numId w:val="3"/>
@@ -951,7 +861,7 @@
                 <w:lang w:eastAsia="en-CA"/>
                 <w14:ligatures w14:val="none"/>
               </w:rPr>
-              <m:t>–K</m:t>
+              <m:t>-K</m:t>
             </m:r>
           </m:e>
         </m:d>
@@ -972,25 +882,7 @@
           <w:lang w:eastAsia="en-CA"/>
           <w14:ligatures w14:val="none"/>
         </w:rPr>
-        <w:t>. L'implémentation Python gère nativement le modul</w:t>
-      </w:r>
-      <w:r>
-        <w:rPr>
-          <w:rFonts w:eastAsia="Times New Roman" w:cs="Arial"/>
-          <w:kern w:val="0"/>
-          <w:lang w:eastAsia="en-CA"/>
-          <w14:ligatures w14:val="none"/>
-        </w:rPr>
-        <w:t>e</w:t>
-      </w:r>
-      <w:r>
-        <w:rPr>
-          <w:rFonts w:eastAsia="Times New Roman" w:cs="Arial"/>
-          <w:kern w:val="0"/>
-          <w:lang w:eastAsia="en-CA"/>
-          <w14:ligatures w14:val="none"/>
-        </w:rPr>
-        <w:t xml:space="preserve"> des valeurs négatives, garantissant la validité du calcul pour </w:t>
+        <w:t xml:space="preserve">. L'implémentation Python gère nativement le module des valeurs négatives, garantissant la validité du calcul pour </w:t>
       </w:r>
       <m:oMath>
         <m:r>
@@ -1015,48 +907,21 @@
     </w:p>
     <w:p>
       <w:pPr>
-        <w:spacing w:after="100" w:afterAutospacing="1" w:line="240" w:lineRule="auto"/>
-        <w:rPr>
-          <w:rFonts w:ascii="Arial" w:eastAsia="Times New Roman" w:hAnsi="Arial" w:cs="Arial"/>
-          <w:kern w:val="0"/>
+        <w:rPr>
           <w:lang w:eastAsia="en-CA"/>
-          <w14:ligatures w14:val="none"/>
-        </w:rPr>
-      </w:pPr>
-      <w:r>
-        <w:rPr>
-          <w:rFonts w:ascii="Arial" w:eastAsia="Times New Roman" w:hAnsi="Arial" w:cs="Arial"/>
-          <w:kern w:val="0"/>
+        </w:rPr>
+      </w:pPr>
+      <w:r>
+        <w:rPr>
           <w:lang w:eastAsia="en-CA"/>
-          <w14:ligatures w14:val="none"/>
-        </w:rPr>
-        <w:t xml:space="preserve">Enigma César (Chiffrement </w:t>
-      </w:r>
-      <w:r>
-        <w:rPr>
-          <w:rFonts w:ascii="Arial" w:eastAsia="Times New Roman" w:hAnsi="Arial" w:cs="Arial"/>
-          <w:kern w:val="0"/>
-          <w:lang w:eastAsia="en-CA"/>
-          <w14:ligatures w14:val="none"/>
-        </w:rPr>
-        <w:t>Poly alphabétique</w:t>
-      </w:r>
-      <w:r>
-        <w:rPr>
-          <w:rFonts w:ascii="Arial" w:eastAsia="Times New Roman" w:hAnsi="Arial" w:cs="Arial"/>
-          <w:kern w:val="0"/>
-          <w:lang w:eastAsia="en-CA"/>
-          <w14:ligatures w14:val="none"/>
-        </w:rPr>
-        <w:t xml:space="preserve">) : Introduit une dépendance temporelle par l'application cyclique d'un vecteur de clés </w:t>
+        </w:rPr>
+        <w:t xml:space="preserve">Enigma César (Chiffrement Poly alphabétique) : Introduit une dépendance temporelle par l'application cyclique d'un vecteur de clés </w:t>
       </w:r>
       <m:oMath>
         <m:r>
           <w:rPr>
-            <w:rFonts w:ascii="Cambria Math" w:eastAsia="Times New Roman" w:hAnsi="Cambria Math" w:cs="Arial"/>
-            <w:kern w:val="0"/>
+            <w:rFonts w:ascii="Cambria Math" w:hAnsi="Cambria Math"/>
             <w:lang w:eastAsia="en-CA"/>
-            <w14:ligatures w14:val="none"/>
           </w:rPr>
           <m:t>K=</m:t>
         </m:r>
@@ -1064,11 +929,9 @@
           <m:dPr>
             <m:ctrlPr>
               <w:rPr>
-                <w:rFonts w:ascii="Cambria Math" w:eastAsia="Times New Roman" w:hAnsi="Cambria Math" w:cs="Arial"/>
+                <w:rFonts w:ascii="Cambria Math" w:hAnsi="Cambria Math"/>
                 <w:i/>
-                <w:kern w:val="0"/>
                 <w:lang w:eastAsia="en-CA"/>
-                <w14:ligatures w14:val="none"/>
               </w:rPr>
             </m:ctrlPr>
           </m:dPr>
@@ -1077,21 +940,17 @@
               <m:sSubPr>
                 <m:ctrlPr>
                   <w:rPr>
-                    <w:rFonts w:ascii="Cambria Math" w:eastAsia="Times New Roman" w:hAnsi="Cambria Math" w:cs="Arial"/>
+                    <w:rFonts w:ascii="Cambria Math" w:hAnsi="Cambria Math"/>
                     <w:i/>
-                    <w:kern w:val="0"/>
                     <w:lang w:eastAsia="en-CA"/>
-                    <w14:ligatures w14:val="none"/>
                   </w:rPr>
                 </m:ctrlPr>
               </m:sSubPr>
               <m:e>
                 <m:r>
                   <w:rPr>
-                    <w:rFonts w:ascii="Cambria Math" w:eastAsia="Times New Roman" w:hAnsi="Cambria Math" w:cs="Arial"/>
-                    <w:kern w:val="0"/>
+                    <w:rFonts w:ascii="Cambria Math" w:hAnsi="Cambria Math"/>
                     <w:lang w:eastAsia="en-CA"/>
-                    <w14:ligatures w14:val="none"/>
                   </w:rPr>
                   <m:t>k</m:t>
                 </m:r>
@@ -1099,10 +958,8 @@
               <m:sub>
                 <m:r>
                   <w:rPr>
-                    <w:rFonts w:ascii="Cambria Math" w:eastAsia="Times New Roman" w:hAnsi="Cambria Math" w:cs="Arial"/>
-                    <w:kern w:val="0"/>
+                    <w:rFonts w:ascii="Cambria Math" w:hAnsi="Cambria Math"/>
                     <w:lang w:eastAsia="en-CA"/>
-                    <w14:ligatures w14:val="none"/>
                   </w:rPr>
                   <m:t>0</m:t>
                 </m:r>
@@ -1110,10 +967,8 @@
             </m:sSub>
             <m:r>
               <w:rPr>
-                <w:rFonts w:ascii="Cambria Math" w:eastAsia="Times New Roman" w:hAnsi="Cambria Math" w:cs="Arial"/>
-                <w:kern w:val="0"/>
+                <w:rFonts w:ascii="Cambria Math" w:hAnsi="Cambria Math"/>
                 <w:lang w:eastAsia="en-CA"/>
-                <w14:ligatures w14:val="none"/>
               </w:rPr>
               <m:t>,</m:t>
             </m:r>
@@ -1121,21 +976,17 @@
               <m:sSubPr>
                 <m:ctrlPr>
                   <w:rPr>
-                    <w:rFonts w:ascii="Cambria Math" w:eastAsia="Times New Roman" w:hAnsi="Cambria Math" w:cs="Arial"/>
+                    <w:rFonts w:ascii="Cambria Math" w:hAnsi="Cambria Math"/>
                     <w:i/>
-                    <w:kern w:val="0"/>
                     <w:lang w:eastAsia="en-CA"/>
-                    <w14:ligatures w14:val="none"/>
                   </w:rPr>
                 </m:ctrlPr>
               </m:sSubPr>
               <m:e>
                 <m:r>
                   <w:rPr>
-                    <w:rFonts w:ascii="Cambria Math" w:eastAsia="Times New Roman" w:hAnsi="Cambria Math" w:cs="Arial"/>
-                    <w:kern w:val="0"/>
+                    <w:rFonts w:ascii="Cambria Math" w:hAnsi="Cambria Math"/>
                     <w:lang w:eastAsia="en-CA"/>
-                    <w14:ligatures w14:val="none"/>
                   </w:rPr>
                   <m:t>k</m:t>
                 </m:r>
@@ -1143,10 +994,8 @@
               <m:sub>
                 <m:r>
                   <w:rPr>
-                    <w:rFonts w:ascii="Cambria Math" w:eastAsia="Times New Roman" w:hAnsi="Cambria Math" w:cs="Arial"/>
-                    <w:kern w:val="0"/>
+                    <w:rFonts w:ascii="Cambria Math" w:hAnsi="Cambria Math"/>
                     <w:lang w:eastAsia="en-CA"/>
-                    <w14:ligatures w14:val="none"/>
                   </w:rPr>
                   <m:t>1</m:t>
                 </m:r>
@@ -1154,10 +1003,8 @@
             </m:sSub>
             <m:r>
               <w:rPr>
-                <w:rFonts w:ascii="Cambria Math" w:eastAsia="Times New Roman" w:hAnsi="Cambria Math" w:cs="Arial"/>
-                <w:kern w:val="0"/>
+                <w:rFonts w:ascii="Cambria Math" w:hAnsi="Cambria Math"/>
                 <w:lang w:eastAsia="en-CA"/>
-                <w14:ligatures w14:val="none"/>
               </w:rPr>
               <m:t>,</m:t>
             </m:r>
@@ -1165,21 +1012,17 @@
               <m:sSubPr>
                 <m:ctrlPr>
                   <w:rPr>
-                    <w:rFonts w:ascii="Cambria Math" w:eastAsia="Times New Roman" w:hAnsi="Cambria Math" w:cs="Arial"/>
+                    <w:rFonts w:ascii="Cambria Math" w:hAnsi="Cambria Math"/>
                     <w:i/>
-                    <w:kern w:val="0"/>
                     <w:lang w:eastAsia="en-CA"/>
-                    <w14:ligatures w14:val="none"/>
                   </w:rPr>
                 </m:ctrlPr>
               </m:sSubPr>
               <m:e>
                 <m:r>
                   <w:rPr>
-                    <w:rFonts w:ascii="Cambria Math" w:eastAsia="Times New Roman" w:hAnsi="Cambria Math" w:cs="Arial"/>
-                    <w:kern w:val="0"/>
+                    <w:rFonts w:ascii="Cambria Math" w:hAnsi="Cambria Math"/>
                     <w:lang w:eastAsia="en-CA"/>
-                    <w14:ligatures w14:val="none"/>
                   </w:rPr>
                   <m:t>k</m:t>
                 </m:r>
@@ -1187,10 +1030,8 @@
               <m:sub>
                 <m:r>
                   <w:rPr>
-                    <w:rFonts w:ascii="Cambria Math" w:eastAsia="Times New Roman" w:hAnsi="Cambria Math" w:cs="Arial"/>
-                    <w:kern w:val="0"/>
+                    <w:rFonts w:ascii="Cambria Math" w:hAnsi="Cambria Math"/>
                     <w:lang w:eastAsia="en-CA"/>
-                    <w14:ligatures w14:val="none"/>
                   </w:rPr>
                   <m:t>2</m:t>
                 </m:r>
@@ -1201,30 +1042,22 @@
       </m:oMath>
       <w:r>
         <w:rPr>
-          <w:rFonts w:ascii="Arial" w:eastAsia="Times New Roman" w:hAnsi="Arial" w:cs="Arial"/>
-          <w:kern w:val="0"/>
           <w:lang w:eastAsia="en-CA"/>
-          <w14:ligatures w14:val="none"/>
         </w:rPr>
         <w:t xml:space="preserve">. Un pointeur d'indexation </w:t>
       </w:r>
       <m:oMath>
         <m:r>
           <w:rPr>
-            <w:rFonts w:ascii="Cambria Math" w:eastAsia="Times New Roman" w:hAnsi="Cambria Math" w:cs="Arial"/>
-            <w:kern w:val="0"/>
+            <w:rFonts w:ascii="Cambria Math" w:hAnsi="Cambria Math"/>
             <w:lang w:eastAsia="en-CA"/>
-            <w14:ligatures w14:val="none"/>
           </w:rPr>
           <m:t>j</m:t>
         </m:r>
       </m:oMath>
       <w:r>
         <w:rPr>
-          <w:rFonts w:ascii="Arial" w:eastAsia="Times New Roman" w:hAnsi="Arial" w:cs="Arial"/>
-          <w:kern w:val="0"/>
           <w:lang w:eastAsia="en-CA"/>
-          <w14:ligatures w14:val="none"/>
         </w:rPr>
         <w:t>, synchronisé uniquement sur les caractères alphabétiques traités, évolue selon la règle récursive :</w:t>
       </w:r>
@@ -1323,7 +1156,7 @@
     </w:p>
     <w:p>
       <w:pPr>
-        <w:pStyle w:val="Heading2"/>
+        <w:pStyle w:val="Titre2"/>
         <w:numPr>
           <w:ilvl w:val="1"/>
           <w:numId w:val="3"/>
@@ -1335,13 +1168,11 @@
     </w:p>
     <w:p>
       <w:r>
-        <w:t>L'attaque par force brute consiste à explorer l'espace des clés de manière exhaustive. Pour César, la</w:t>
-      </w:r>
-      <w:r>
-        <w:t xml:space="preserve"> </w:t>
-      </w:r>
-      <w:r>
-        <w:t xml:space="preserve">dimension spatiale est restreinte (N = 26). Pour Enigma César, l'espace croît de façon combinatoire à </w:t>
+        <w:t xml:space="preserve">L'attaque par force brute consiste à explorer l'espace des clés de manière exhaustive. Pour César, la dimension spatiale est restreinte (N = 26). Pour Enigma César, l'espace croît de </w:t>
+      </w:r>
+      <w:r>
+        <w:lastRenderedPageBreak/>
+        <w:t xml:space="preserve">façon combinatoire à </w:t>
       </w:r>
       <m:oMath>
         <m:r>
@@ -1384,11 +1215,7 @@
         </m:r>
       </m:oMath>
       <w:r>
-        <w:t xml:space="preserve"> combinaisons. Les permutations sont générées </w:t>
-      </w:r>
-      <w:r>
-        <w:lastRenderedPageBreak/>
-        <w:t xml:space="preserve">via l'itérateur hautement optimisé </w:t>
+        <w:t xml:space="preserve"> combinaisons. Les permutations sont générées via l'itérateur hautement optimisé </w:t>
       </w:r>
       <w:r>
         <w:rPr>
@@ -1478,7 +1305,7 @@
     </w:p>
     <w:p>
       <w:pPr>
-        <w:pStyle w:val="Heading2"/>
+        <w:pStyle w:val="Titre2"/>
         <w:numPr>
           <w:ilvl w:val="0"/>
           <w:numId w:val="3"/>
@@ -1620,7 +1447,7 @@
     </w:p>
     <w:tbl>
       <w:tblPr>
-        <w:tblStyle w:val="GridTable4-Accent1"/>
+        <w:tblStyle w:val="TableauGrille4-Accentuation1"/>
         <w:tblW w:w="0" w:type="auto"/>
         <w:tblLook w:val="04A0" w:firstRow="1" w:lastRow="0" w:firstColumn="1" w:lastColumn="0" w:noHBand="0" w:noVBand="1"/>
       </w:tblPr>
@@ -1967,12 +1794,12 @@
     </w:tbl>
     <w:p>
       <w:pPr>
-        <w:pStyle w:val="Heading2"/>
+        <w:pStyle w:val="Titre2"/>
       </w:pPr>
     </w:p>
     <w:p>
       <w:pPr>
-        <w:pStyle w:val="Heading2"/>
+        <w:pStyle w:val="Titre2"/>
         <w:numPr>
           <w:ilvl w:val="0"/>
           <w:numId w:val="6"/>
@@ -1992,7 +1819,7 @@
     </w:p>
     <w:tbl>
       <w:tblPr>
-        <w:tblStyle w:val="GridTable4-Accent1"/>
+        <w:tblStyle w:val="TableauGrille4-Accentuation1"/>
         <w:tblW w:w="0" w:type="auto"/>
         <w:tblLayout w:type="fixed"/>
         <w:tblLook w:val="04A0" w:firstRow="1" w:lastRow="0" w:firstColumn="1" w:lastColumn="0" w:noHBand="0" w:noVBand="1"/>
@@ -2071,7 +1898,7 @@
           </w:tcPr>
           <w:p>
             <w:pPr>
-              <w:pStyle w:val="ListParagraph"/>
+              <w:pStyle w:val="Paragraphedeliste"/>
               <w:numPr>
                 <w:ilvl w:val="0"/>
                 <w:numId w:val="7"/>
@@ -2084,7 +1911,7 @@
           </w:p>
           <w:p>
             <w:pPr>
-              <w:pStyle w:val="ListParagraph"/>
+              <w:pStyle w:val="Paragraphedeliste"/>
               <w:numPr>
                 <w:ilvl w:val="0"/>
                 <w:numId w:val="7"/>
@@ -2129,7 +1956,7 @@
           </w:tcPr>
           <w:p>
             <w:pPr>
-              <w:pStyle w:val="ListParagraph"/>
+              <w:pStyle w:val="Paragraphedeliste"/>
               <w:numPr>
                 <w:ilvl w:val="0"/>
                 <w:numId w:val="8"/>
@@ -2142,7 +1969,7 @@
           </w:p>
           <w:p>
             <w:pPr>
-              <w:pStyle w:val="ListParagraph"/>
+              <w:pStyle w:val="Paragraphedeliste"/>
               <w:numPr>
                 <w:ilvl w:val="0"/>
                 <w:numId w:val="8"/>
@@ -2193,7 +2020,7 @@
           </w:tcPr>
           <w:p>
             <w:pPr>
-              <w:pStyle w:val="ListParagraph"/>
+              <w:pStyle w:val="Paragraphedeliste"/>
               <w:numPr>
                 <w:ilvl w:val="0"/>
                 <w:numId w:val="9"/>
@@ -2212,7 +2039,7 @@
           </w:p>
           <w:p>
             <w:pPr>
-              <w:pStyle w:val="ListParagraph"/>
+              <w:pStyle w:val="Paragraphedeliste"/>
               <w:numPr>
                 <w:ilvl w:val="0"/>
                 <w:numId w:val="9"/>
@@ -3624,11 +3451,11 @@
       <w:lang w:val="fr-CA"/>
     </w:rPr>
   </w:style>
-  <w:style w:type="paragraph" w:styleId="Heading1">
+  <w:style w:type="paragraph" w:styleId="Titre1">
     <w:name w:val="heading 1"/>
     <w:basedOn w:val="Normal"/>
     <w:next w:val="Normal"/>
-    <w:link w:val="Heading1Char"/>
+    <w:link w:val="Titre1Car"/>
     <w:uiPriority w:val="9"/>
     <w:qFormat/>
     <w:rsid w:val="00FF27B8"/>
@@ -3645,11 +3472,11 @@
       <w:szCs w:val="40"/>
     </w:rPr>
   </w:style>
-  <w:style w:type="paragraph" w:styleId="Heading2">
+  <w:style w:type="paragraph" w:styleId="Titre2">
     <w:name w:val="heading 2"/>
     <w:basedOn w:val="Normal"/>
     <w:next w:val="Normal"/>
-    <w:link w:val="Heading2Char"/>
+    <w:link w:val="Titre2Car"/>
     <w:uiPriority w:val="9"/>
     <w:unhideWhenUsed/>
     <w:qFormat/>
@@ -3667,11 +3494,11 @@
       <w:szCs w:val="32"/>
     </w:rPr>
   </w:style>
-  <w:style w:type="paragraph" w:styleId="Heading3">
+  <w:style w:type="paragraph" w:styleId="Titre3">
     <w:name w:val="heading 3"/>
     <w:basedOn w:val="Normal"/>
     <w:next w:val="Normal"/>
-    <w:link w:val="Heading3Char"/>
+    <w:link w:val="Titre3Car"/>
     <w:uiPriority w:val="9"/>
     <w:semiHidden/>
     <w:unhideWhenUsed/>
@@ -3690,11 +3517,11 @@
       <w:szCs w:val="28"/>
     </w:rPr>
   </w:style>
-  <w:style w:type="paragraph" w:styleId="Heading4">
+  <w:style w:type="paragraph" w:styleId="Titre4">
     <w:name w:val="heading 4"/>
     <w:basedOn w:val="Normal"/>
     <w:next w:val="Normal"/>
-    <w:link w:val="Heading4Char"/>
+    <w:link w:val="Titre4Car"/>
     <w:uiPriority w:val="9"/>
     <w:semiHidden/>
     <w:unhideWhenUsed/>
@@ -3713,11 +3540,11 @@
       <w:color w:val="0F4761" w:themeColor="accent1" w:themeShade="BF"/>
     </w:rPr>
   </w:style>
-  <w:style w:type="paragraph" w:styleId="Heading5">
+  <w:style w:type="paragraph" w:styleId="Titre5">
     <w:name w:val="heading 5"/>
     <w:basedOn w:val="Normal"/>
     <w:next w:val="Normal"/>
-    <w:link w:val="Heading5Char"/>
+    <w:link w:val="Titre5Car"/>
     <w:uiPriority w:val="9"/>
     <w:semiHidden/>
     <w:unhideWhenUsed/>
@@ -3734,11 +3561,11 @@
       <w:color w:val="0F4761" w:themeColor="accent1" w:themeShade="BF"/>
     </w:rPr>
   </w:style>
-  <w:style w:type="paragraph" w:styleId="Heading6">
+  <w:style w:type="paragraph" w:styleId="Titre6">
     <w:name w:val="heading 6"/>
     <w:basedOn w:val="Normal"/>
     <w:next w:val="Normal"/>
-    <w:link w:val="Heading6Char"/>
+    <w:link w:val="Titre6Car"/>
     <w:uiPriority w:val="9"/>
     <w:semiHidden/>
     <w:unhideWhenUsed/>
@@ -3757,11 +3584,11 @@
       <w:color w:val="595959" w:themeColor="text1" w:themeTint="A6"/>
     </w:rPr>
   </w:style>
-  <w:style w:type="paragraph" w:styleId="Heading7">
+  <w:style w:type="paragraph" w:styleId="Titre7">
     <w:name w:val="heading 7"/>
     <w:basedOn w:val="Normal"/>
     <w:next w:val="Normal"/>
-    <w:link w:val="Heading7Char"/>
+    <w:link w:val="Titre7Car"/>
     <w:uiPriority w:val="9"/>
     <w:semiHidden/>
     <w:unhideWhenUsed/>
@@ -3778,11 +3605,11 @@
       <w:color w:val="595959" w:themeColor="text1" w:themeTint="A6"/>
     </w:rPr>
   </w:style>
-  <w:style w:type="paragraph" w:styleId="Heading8">
+  <w:style w:type="paragraph" w:styleId="Titre8">
     <w:name w:val="heading 8"/>
     <w:basedOn w:val="Normal"/>
     <w:next w:val="Normal"/>
-    <w:link w:val="Heading8Char"/>
+    <w:link w:val="Titre8Car"/>
     <w:uiPriority w:val="9"/>
     <w:semiHidden/>
     <w:unhideWhenUsed/>
@@ -3801,11 +3628,11 @@
       <w:color w:val="272727" w:themeColor="text1" w:themeTint="D8"/>
     </w:rPr>
   </w:style>
-  <w:style w:type="paragraph" w:styleId="Heading9">
+  <w:style w:type="paragraph" w:styleId="Titre9">
     <w:name w:val="heading 9"/>
     <w:basedOn w:val="Normal"/>
     <w:next w:val="Normal"/>
-    <w:link w:val="Heading9Char"/>
+    <w:link w:val="Titre9Car"/>
     <w:uiPriority w:val="9"/>
     <w:semiHidden/>
     <w:unhideWhenUsed/>
@@ -3822,12 +3649,13 @@
       <w:color w:val="272727" w:themeColor="text1" w:themeTint="D8"/>
     </w:rPr>
   </w:style>
-  <w:style w:type="character" w:default="1" w:styleId="DefaultParagraphFont">
+  <w:style w:type="character" w:default="1" w:styleId="Policepardfaut">
     <w:name w:val="Default Paragraph Font"/>
     <w:uiPriority w:val="1"/>
+    <w:semiHidden/>
     <w:unhideWhenUsed/>
   </w:style>
-  <w:style w:type="table" w:default="1" w:styleId="TableNormal">
+  <w:style w:type="table" w:default="1" w:styleId="TableauNormal">
     <w:name w:val="Normal Table"/>
     <w:uiPriority w:val="99"/>
     <w:semiHidden/>
@@ -3842,16 +3670,16 @@
       </w:tblCellMar>
     </w:tblPr>
   </w:style>
-  <w:style w:type="numbering" w:default="1" w:styleId="NoList">
+  <w:style w:type="numbering" w:default="1" w:styleId="Aucuneliste">
     <w:name w:val="No List"/>
     <w:uiPriority w:val="99"/>
     <w:semiHidden/>
     <w:unhideWhenUsed/>
   </w:style>
-  <w:style w:type="character" w:customStyle="1" w:styleId="Heading1Char">
-    <w:name w:val="Heading 1 Char"/>
-    <w:basedOn w:val="DefaultParagraphFont"/>
-    <w:link w:val="Heading1"/>
+  <w:style w:type="character" w:customStyle="1" w:styleId="Titre1Car">
+    <w:name w:val="Titre 1 Car"/>
+    <w:basedOn w:val="Policepardfaut"/>
+    <w:link w:val="Titre1"/>
     <w:uiPriority w:val="9"/>
     <w:rsid w:val="00FF27B8"/>
     <w:rPr>
@@ -3861,10 +3689,10 @@
       <w:szCs w:val="40"/>
     </w:rPr>
   </w:style>
-  <w:style w:type="character" w:customStyle="1" w:styleId="Heading2Char">
-    <w:name w:val="Heading 2 Char"/>
-    <w:basedOn w:val="DefaultParagraphFont"/>
-    <w:link w:val="Heading2"/>
+  <w:style w:type="character" w:customStyle="1" w:styleId="Titre2Car">
+    <w:name w:val="Titre 2 Car"/>
+    <w:basedOn w:val="Policepardfaut"/>
+    <w:link w:val="Titre2"/>
     <w:uiPriority w:val="9"/>
     <w:rsid w:val="00FF27B8"/>
     <w:rPr>
@@ -3874,10 +3702,10 @@
       <w:szCs w:val="32"/>
     </w:rPr>
   </w:style>
-  <w:style w:type="character" w:customStyle="1" w:styleId="Heading3Char">
-    <w:name w:val="Heading 3 Char"/>
-    <w:basedOn w:val="DefaultParagraphFont"/>
-    <w:link w:val="Heading3"/>
+  <w:style w:type="character" w:customStyle="1" w:styleId="Titre3Car">
+    <w:name w:val="Titre 3 Car"/>
+    <w:basedOn w:val="Policepardfaut"/>
+    <w:link w:val="Titre3"/>
     <w:uiPriority w:val="9"/>
     <w:semiHidden/>
     <w:rsid w:val="00FF27B8"/>
@@ -3888,10 +3716,10 @@
       <w:szCs w:val="28"/>
     </w:rPr>
   </w:style>
-  <w:style w:type="character" w:customStyle="1" w:styleId="Heading4Char">
-    <w:name w:val="Heading 4 Char"/>
-    <w:basedOn w:val="DefaultParagraphFont"/>
-    <w:link w:val="Heading4"/>
+  <w:style w:type="character" w:customStyle="1" w:styleId="Titre4Car">
+    <w:name w:val="Titre 4 Car"/>
+    <w:basedOn w:val="Policepardfaut"/>
+    <w:link w:val="Titre4"/>
     <w:uiPriority w:val="9"/>
     <w:semiHidden/>
     <w:rsid w:val="00FF27B8"/>
@@ -3902,10 +3730,10 @@
       <w:color w:val="0F4761" w:themeColor="accent1" w:themeShade="BF"/>
     </w:rPr>
   </w:style>
-  <w:style w:type="character" w:customStyle="1" w:styleId="Heading5Char">
-    <w:name w:val="Heading 5 Char"/>
-    <w:basedOn w:val="DefaultParagraphFont"/>
-    <w:link w:val="Heading5"/>
+  <w:style w:type="character" w:customStyle="1" w:styleId="Titre5Car">
+    <w:name w:val="Titre 5 Car"/>
+    <w:basedOn w:val="Policepardfaut"/>
+    <w:link w:val="Titre5"/>
     <w:uiPriority w:val="9"/>
     <w:semiHidden/>
     <w:rsid w:val="00FF27B8"/>
@@ -3914,10 +3742,10 @@
       <w:color w:val="0F4761" w:themeColor="accent1" w:themeShade="BF"/>
     </w:rPr>
   </w:style>
-  <w:style w:type="character" w:customStyle="1" w:styleId="Heading6Char">
-    <w:name w:val="Heading 6 Char"/>
-    <w:basedOn w:val="DefaultParagraphFont"/>
-    <w:link w:val="Heading6"/>
+  <w:style w:type="character" w:customStyle="1" w:styleId="Titre6Car">
+    <w:name w:val="Titre 6 Car"/>
+    <w:basedOn w:val="Policepardfaut"/>
+    <w:link w:val="Titre6"/>
     <w:uiPriority w:val="9"/>
     <w:semiHidden/>
     <w:rsid w:val="00FF27B8"/>
@@ -3928,10 +3756,10 @@
       <w:color w:val="595959" w:themeColor="text1" w:themeTint="A6"/>
     </w:rPr>
   </w:style>
-  <w:style w:type="character" w:customStyle="1" w:styleId="Heading7Char">
-    <w:name w:val="Heading 7 Char"/>
-    <w:basedOn w:val="DefaultParagraphFont"/>
-    <w:link w:val="Heading7"/>
+  <w:style w:type="character" w:customStyle="1" w:styleId="Titre7Car">
+    <w:name w:val="Titre 7 Car"/>
+    <w:basedOn w:val="Policepardfaut"/>
+    <w:link w:val="Titre7"/>
     <w:uiPriority w:val="9"/>
     <w:semiHidden/>
     <w:rsid w:val="00FF27B8"/>
@@ -3940,10 +3768,10 @@
       <w:color w:val="595959" w:themeColor="text1" w:themeTint="A6"/>
     </w:rPr>
   </w:style>
-  <w:style w:type="character" w:customStyle="1" w:styleId="Heading8Char">
-    <w:name w:val="Heading 8 Char"/>
-    <w:basedOn w:val="DefaultParagraphFont"/>
-    <w:link w:val="Heading8"/>
+  <w:style w:type="character" w:customStyle="1" w:styleId="Titre8Car">
+    <w:name w:val="Titre 8 Car"/>
+    <w:basedOn w:val="Policepardfaut"/>
+    <w:link w:val="Titre8"/>
     <w:uiPriority w:val="9"/>
     <w:semiHidden/>
     <w:rsid w:val="00FF27B8"/>
@@ -3954,10 +3782,10 @@
       <w:color w:val="272727" w:themeColor="text1" w:themeTint="D8"/>
     </w:rPr>
   </w:style>
-  <w:style w:type="character" w:customStyle="1" w:styleId="Heading9Char">
-    <w:name w:val="Heading 9 Char"/>
-    <w:basedOn w:val="DefaultParagraphFont"/>
-    <w:link w:val="Heading9"/>
+  <w:style w:type="character" w:customStyle="1" w:styleId="Titre9Car">
+    <w:name w:val="Titre 9 Car"/>
+    <w:basedOn w:val="Policepardfaut"/>
+    <w:link w:val="Titre9"/>
     <w:uiPriority w:val="9"/>
     <w:semiHidden/>
     <w:rsid w:val="00FF27B8"/>
@@ -3966,11 +3794,11 @@
       <w:color w:val="272727" w:themeColor="text1" w:themeTint="D8"/>
     </w:rPr>
   </w:style>
-  <w:style w:type="paragraph" w:styleId="Title">
+  <w:style w:type="paragraph" w:styleId="Titre">
     <w:name w:val="Title"/>
     <w:basedOn w:val="Normal"/>
     <w:next w:val="Normal"/>
-    <w:link w:val="TitleChar"/>
+    <w:link w:val="TitreCar"/>
     <w:uiPriority w:val="10"/>
     <w:qFormat/>
     <w:rsid w:val="00FF27B8"/>
@@ -3986,10 +3814,10 @@
       <w:szCs w:val="56"/>
     </w:rPr>
   </w:style>
-  <w:style w:type="character" w:customStyle="1" w:styleId="TitleChar">
-    <w:name w:val="Title Char"/>
-    <w:basedOn w:val="DefaultParagraphFont"/>
-    <w:link w:val="Title"/>
+  <w:style w:type="character" w:customStyle="1" w:styleId="TitreCar">
+    <w:name w:val="Titre Car"/>
+    <w:basedOn w:val="Policepardfaut"/>
+    <w:link w:val="Titre"/>
     <w:uiPriority w:val="10"/>
     <w:rsid w:val="00FF27B8"/>
     <w:rPr>
@@ -4000,11 +3828,11 @@
       <w:szCs w:val="56"/>
     </w:rPr>
   </w:style>
-  <w:style w:type="paragraph" w:styleId="Subtitle">
+  <w:style w:type="paragraph" w:styleId="Sous-titre">
     <w:name w:val="Subtitle"/>
     <w:basedOn w:val="Normal"/>
     <w:next w:val="Normal"/>
-    <w:link w:val="SubtitleChar"/>
+    <w:link w:val="Sous-titreCar"/>
     <w:uiPriority w:val="11"/>
     <w:qFormat/>
     <w:rsid w:val="00FF27B8"/>
@@ -4021,10 +3849,10 @@
       <w:szCs w:val="28"/>
     </w:rPr>
   </w:style>
-  <w:style w:type="character" w:customStyle="1" w:styleId="SubtitleChar">
-    <w:name w:val="Subtitle Char"/>
-    <w:basedOn w:val="DefaultParagraphFont"/>
-    <w:link w:val="Subtitle"/>
+  <w:style w:type="character" w:customStyle="1" w:styleId="Sous-titreCar">
+    <w:name w:val="Sous-titre Car"/>
+    <w:basedOn w:val="Policepardfaut"/>
+    <w:link w:val="Sous-titre"/>
     <w:uiPriority w:val="11"/>
     <w:rsid w:val="00FF27B8"/>
     <w:rPr>
@@ -4035,11 +3863,11 @@
       <w:szCs w:val="28"/>
     </w:rPr>
   </w:style>
-  <w:style w:type="paragraph" w:styleId="Quote">
+  <w:style w:type="paragraph" w:styleId="Citation">
     <w:name w:val="Quote"/>
     <w:basedOn w:val="Normal"/>
     <w:next w:val="Normal"/>
-    <w:link w:val="QuoteChar"/>
+    <w:link w:val="CitationCar"/>
     <w:uiPriority w:val="29"/>
     <w:qFormat/>
     <w:rsid w:val="00FF27B8"/>
@@ -4053,10 +3881,10 @@
       <w:color w:val="404040" w:themeColor="text1" w:themeTint="BF"/>
     </w:rPr>
   </w:style>
-  <w:style w:type="character" w:customStyle="1" w:styleId="QuoteChar">
-    <w:name w:val="Quote Char"/>
-    <w:basedOn w:val="DefaultParagraphFont"/>
-    <w:link w:val="Quote"/>
+  <w:style w:type="character" w:customStyle="1" w:styleId="CitationCar">
+    <w:name w:val="Citation Car"/>
+    <w:basedOn w:val="Policepardfaut"/>
+    <w:link w:val="Citation"/>
     <w:uiPriority w:val="29"/>
     <w:rsid w:val="00FF27B8"/>
     <w:rPr>
@@ -4065,7 +3893,7 @@
       <w:color w:val="404040" w:themeColor="text1" w:themeTint="BF"/>
     </w:rPr>
   </w:style>
-  <w:style w:type="paragraph" w:styleId="ListParagraph">
+  <w:style w:type="paragraph" w:styleId="Paragraphedeliste">
     <w:name w:val="List Paragraph"/>
     <w:basedOn w:val="Normal"/>
     <w:uiPriority w:val="34"/>
@@ -4076,9 +3904,9 @@
       <w:contextualSpacing/>
     </w:pPr>
   </w:style>
-  <w:style w:type="character" w:styleId="IntenseEmphasis">
+  <w:style w:type="character" w:styleId="Accentuationintense">
     <w:name w:val="Intense Emphasis"/>
-    <w:basedOn w:val="DefaultParagraphFont"/>
+    <w:basedOn w:val="Policepardfaut"/>
     <w:uiPriority w:val="21"/>
     <w:qFormat/>
     <w:rsid w:val="00FF27B8"/>
@@ -4088,11 +3916,11 @@
       <w:color w:val="0F4761" w:themeColor="accent1" w:themeShade="BF"/>
     </w:rPr>
   </w:style>
-  <w:style w:type="paragraph" w:styleId="IntenseQuote">
+  <w:style w:type="paragraph" w:styleId="Citationintense">
     <w:name w:val="Intense Quote"/>
     <w:basedOn w:val="Normal"/>
     <w:next w:val="Normal"/>
-    <w:link w:val="IntenseQuoteChar"/>
+    <w:link w:val="CitationintenseCar"/>
     <w:uiPriority w:val="30"/>
     <w:qFormat/>
     <w:rsid w:val="00FF27B8"/>
@@ -4111,10 +3939,10 @@
       <w:color w:val="0F4761" w:themeColor="accent1" w:themeShade="BF"/>
     </w:rPr>
   </w:style>
-  <w:style w:type="character" w:customStyle="1" w:styleId="IntenseQuoteChar">
-    <w:name w:val="Intense Quote Char"/>
-    <w:basedOn w:val="DefaultParagraphFont"/>
-    <w:link w:val="IntenseQuote"/>
+  <w:style w:type="character" w:customStyle="1" w:styleId="CitationintenseCar">
+    <w:name w:val="Citation intense Car"/>
+    <w:basedOn w:val="Policepardfaut"/>
+    <w:link w:val="Citationintense"/>
     <w:uiPriority w:val="30"/>
     <w:rsid w:val="00FF27B8"/>
     <w:rPr>
@@ -4123,9 +3951,9 @@
       <w:color w:val="0F4761" w:themeColor="accent1" w:themeShade="BF"/>
     </w:rPr>
   </w:style>
-  <w:style w:type="character" w:styleId="IntenseReference">
+  <w:style w:type="character" w:styleId="Rfrenceintense">
     <w:name w:val="Intense Reference"/>
-    <w:basedOn w:val="DefaultParagraphFont"/>
+    <w:basedOn w:val="Policepardfaut"/>
     <w:uiPriority w:val="32"/>
     <w:qFormat/>
     <w:rsid w:val="00FF27B8"/>
@@ -4156,12 +3984,12 @@
   </w:style>
   <w:style w:type="character" w:customStyle="1" w:styleId="math-inline">
     <w:name w:val="math-inline"/>
-    <w:basedOn w:val="DefaultParagraphFont"/>
+    <w:basedOn w:val="Policepardfaut"/>
     <w:rsid w:val="001D33ED"/>
   </w:style>
-  <w:style w:type="table" w:styleId="TableGrid">
+  <w:style w:type="table" w:styleId="Grilledutableau">
     <w:name w:val="Table Grid"/>
-    <w:basedOn w:val="TableNormal"/>
+    <w:basedOn w:val="TableauNormal"/>
     <w:uiPriority w:val="39"/>
     <w:rsid w:val="00A03450"/>
     <w:pPr>
@@ -4178,9 +4006,9 @@
       </w:tblBorders>
     </w:tblPr>
   </w:style>
-  <w:style w:type="table" w:styleId="GridTable4-Accent1">
+  <w:style w:type="table" w:styleId="TableauGrille4-Accentuation1">
     <w:name w:val="Grid Table 4 Accent 1"/>
-    <w:basedOn w:val="TableNormal"/>
+    <w:basedOn w:val="TableauNormal"/>
     <w:uiPriority w:val="49"/>
     <w:rsid w:val="00A03450"/>
     <w:pPr>
@@ -4254,9 +4082,9 @@
       </w:tcPr>
     </w:tblStylePr>
   </w:style>
-  <w:style w:type="character" w:styleId="PlaceholderText">
+  <w:style w:type="character" w:styleId="Textedelespacerserv">
     <w:name w:val="Placeholder Text"/>
-    <w:basedOn w:val="DefaultParagraphFont"/>
+    <w:basedOn w:val="Policepardfaut"/>
     <w:uiPriority w:val="99"/>
     <w:semiHidden/>
     <w:rsid w:val="00A03450"/>
@@ -4264,9 +4092,9 @@
       <w:color w:val="666666"/>
     </w:rPr>
   </w:style>
-  <w:style w:type="character" w:styleId="HTMLCode">
+  <w:style w:type="character" w:styleId="CodeHTML">
     <w:name w:val="HTML Code"/>
-    <w:basedOn w:val="DefaultParagraphFont"/>
+    <w:basedOn w:val="Policepardfaut"/>
     <w:uiPriority w:val="99"/>
     <w:semiHidden/>
     <w:unhideWhenUsed/>

</xml_diff>

<commit_message>
doc : mise à jour finale du rapport
</commit_message>
<xml_diff>
--- a/Rapport.docx
+++ b/Rapport.docx
@@ -148,11 +148,6 @@
       </w:r>
     </w:p>
     <w:p>
-      <w:r>
-        <w:t>Cette structure garantit une validation stricte des paramètres en amont, empêchant les crashs inattendus et offrant des messages de retour clairs à l'utilisateur directement dans le terminal.</w:t>
-      </w:r>
-    </w:p>
-    <w:p>
       <w:pPr>
         <w:jc w:val="center"/>
       </w:pPr>
@@ -161,10 +156,10 @@
           <w:noProof/>
         </w:rPr>
         <w:drawing>
-          <wp:inline distT="0" distB="0" distL="0" distR="0" wp14:anchorId="4BEE7AE7" wp14:editId="734D372D">
-            <wp:extent cx="4657725" cy="2624176"/>
-            <wp:effectExtent l="0" t="0" r="0" b="5080"/>
-            <wp:docPr id="1321505531" name="Picture 1"/>
+          <wp:inline distT="0" distB="0" distL="0" distR="0" wp14:anchorId="422998B3" wp14:editId="749F0586">
+            <wp:extent cx="4779563" cy="2685056"/>
+            <wp:effectExtent l="0" t="0" r="2540" b="1270"/>
+            <wp:docPr id="93563480" name="Picture 1"/>
             <wp:cNvGraphicFramePr>
               <a:graphicFrameLocks xmlns:a="http://schemas.openxmlformats.org/drawingml/2006/main" noChangeAspect="1"/>
             </wp:cNvGraphicFramePr>
@@ -193,7 +188,7 @@
                   <pic:spPr bwMode="auto">
                     <a:xfrm>
                       <a:off x="0" y="0"/>
-                      <a:ext cx="4662122" cy="2626653"/>
+                      <a:ext cx="4785657" cy="2688479"/>
                     </a:xfrm>
                     <a:prstGeom prst="rect">
                       <a:avLst/>
@@ -212,7 +207,6 @@
     </w:p>
     <w:p>
       <w:r>
-        <w:lastRenderedPageBreak/>
         <w:t>Cette structure garantit une validation stricte des paramètres en amont, empêchant les crashs inattendus et offrant des messages de retour clairs à l'utilisateur directement dans le terminal.</w:t>
       </w:r>
     </w:p>
@@ -225,6 +219,7 @@
         </w:numPr>
       </w:pPr>
       <w:r>
+        <w:lastRenderedPageBreak/>
         <w:t>CONCEPTION ALGORITHMIQUE</w:t>
       </w:r>
     </w:p>
@@ -300,27 +295,38 @@
           <w:lang w:val="en-CA"/>
         </w:rPr>
       </w:pPr>
+      <w:proofErr w:type="spellStart"/>
       <w:r>
         <w:rPr>
           <w:rFonts w:ascii="Courier New" w:hAnsi="Courier New" w:cs="Courier New"/>
           <w:lang w:val="en-CA"/>
         </w:rPr>
-        <w:t xml:space="preserve">mot_normalise = </w:t>
-      </w:r>
-      <w:proofErr w:type="gramStart"/>
+        <w:t>mot_normalise</w:t>
+      </w:r>
+      <w:proofErr w:type="spellEnd"/>
       <w:r>
         <w:rPr>
           <w:rFonts w:ascii="Courier New" w:hAnsi="Courier New" w:cs="Courier New"/>
           <w:lang w:val="en-CA"/>
         </w:rPr>
-        <w:t>unicodedata.normalize</w:t>
-      </w:r>
-      <w:proofErr w:type="gramEnd"/>
+        <w:t xml:space="preserve"> = </w:t>
+      </w:r>
+      <w:proofErr w:type="spellStart"/>
+      <w:proofErr w:type="gramStart"/>
       <w:r>
         <w:rPr>
           <w:rFonts w:ascii="Courier New" w:hAnsi="Courier New" w:cs="Courier New"/>
           <w:lang w:val="en-CA"/>
         </w:rPr>
+        <w:t>unicodedata.normalize</w:t>
+      </w:r>
+      <w:proofErr w:type="spellEnd"/>
+      <w:proofErr w:type="gramEnd"/>
+      <w:r>
+        <w:rPr>
+          <w:rFonts w:ascii="Courier New" w:hAnsi="Courier New" w:cs="Courier New"/>
+          <w:lang w:val="en-CA"/>
+        </w:rPr>
         <w:t>('NFKD', message)</w:t>
       </w:r>
     </w:p>
@@ -331,37 +337,64 @@
           <w:lang w:val="en-CA"/>
         </w:rPr>
       </w:pPr>
+      <w:proofErr w:type="spellStart"/>
       <w:r>
         <w:rPr>
           <w:rFonts w:ascii="Courier New" w:hAnsi="Courier New" w:cs="Courier New"/>
           <w:lang w:val="en-CA"/>
         </w:rPr>
-        <w:t>message_propre = '</w:t>
-      </w:r>
-      <w:proofErr w:type="gramStart"/>
+        <w:t>message_propre</w:t>
+      </w:r>
+      <w:proofErr w:type="spellEnd"/>
       <w:r>
         <w:rPr>
           <w:rFonts w:ascii="Courier New" w:hAnsi="Courier New" w:cs="Courier New"/>
           <w:lang w:val="en-CA"/>
         </w:rPr>
-        <w:t>'.join</w:t>
-      </w:r>
-      <w:proofErr w:type="gramEnd"/>
+        <w:t xml:space="preserve"> = '</w:t>
+      </w:r>
+      <w:proofErr w:type="gramStart"/>
       <w:r>
         <w:rPr>
           <w:rFonts w:ascii="Courier New" w:hAnsi="Courier New" w:cs="Courier New"/>
           <w:lang w:val="en-CA"/>
         </w:rPr>
-        <w:t xml:space="preserve">([c for c in mot_normalise if not </w:t>
-      </w:r>
-      <w:proofErr w:type="gramStart"/>
+        <w:t>'.join</w:t>
+      </w:r>
+      <w:proofErr w:type="gramEnd"/>
       <w:r>
         <w:rPr>
           <w:rFonts w:ascii="Courier New" w:hAnsi="Courier New" w:cs="Courier New"/>
           <w:lang w:val="en-CA"/>
         </w:rPr>
+        <w:t xml:space="preserve">([c for c in </w:t>
+      </w:r>
+      <w:proofErr w:type="spellStart"/>
+      <w:r>
+        <w:rPr>
+          <w:rFonts w:ascii="Courier New" w:hAnsi="Courier New" w:cs="Courier New"/>
+          <w:lang w:val="en-CA"/>
+        </w:rPr>
+        <w:t>mot_normalise</w:t>
+      </w:r>
+      <w:proofErr w:type="spellEnd"/>
+      <w:r>
+        <w:rPr>
+          <w:rFonts w:ascii="Courier New" w:hAnsi="Courier New" w:cs="Courier New"/>
+          <w:lang w:val="en-CA"/>
+        </w:rPr>
+        <w:t xml:space="preserve"> if not </w:t>
+      </w:r>
+      <w:proofErr w:type="spellStart"/>
+      <w:proofErr w:type="gramStart"/>
+      <w:r>
+        <w:rPr>
+          <w:rFonts w:ascii="Courier New" w:hAnsi="Courier New" w:cs="Courier New"/>
+          <w:lang w:val="en-CA"/>
+        </w:rPr>
         <w:t>unicodedata.combining</w:t>
       </w:r>
+      <w:proofErr w:type="spellEnd"/>
       <w:proofErr w:type="gramEnd"/>
       <w:r>
         <w:rPr>
@@ -907,21 +940,30 @@
     </w:p>
     <w:p>
       <w:pPr>
-        <w:rPr>
+        <w:spacing w:after="100" w:afterAutospacing="1" w:line="240" w:lineRule="auto"/>
+        <w:rPr>
+          <w:rFonts w:ascii="Arial" w:eastAsia="Times New Roman" w:hAnsi="Arial" w:cs="Arial"/>
+          <w:kern w:val="0"/>
           <w:lang w:eastAsia="en-CA"/>
-        </w:rPr>
-      </w:pPr>
-      <w:r>
-        <w:rPr>
+          <w14:ligatures w14:val="none"/>
+        </w:rPr>
+      </w:pPr>
+      <w:r>
+        <w:rPr>
+          <w:rFonts w:ascii="Arial" w:eastAsia="Times New Roman" w:hAnsi="Arial" w:cs="Arial"/>
+          <w:kern w:val="0"/>
           <w:lang w:eastAsia="en-CA"/>
+          <w14:ligatures w14:val="none"/>
         </w:rPr>
         <w:t xml:space="preserve">Enigma César (Chiffrement Poly alphabétique) : Introduit une dépendance temporelle par l'application cyclique d'un vecteur de clés </w:t>
       </w:r>
       <m:oMath>
         <m:r>
           <w:rPr>
-            <w:rFonts w:ascii="Cambria Math" w:hAnsi="Cambria Math"/>
+            <w:rFonts w:ascii="Cambria Math" w:eastAsia="Times New Roman" w:hAnsi="Cambria Math" w:cs="Arial"/>
+            <w:kern w:val="0"/>
             <w:lang w:eastAsia="en-CA"/>
+            <w14:ligatures w14:val="none"/>
           </w:rPr>
           <m:t>K=</m:t>
         </m:r>
@@ -929,9 +971,11 @@
           <m:dPr>
             <m:ctrlPr>
               <w:rPr>
-                <w:rFonts w:ascii="Cambria Math" w:hAnsi="Cambria Math"/>
+                <w:rFonts w:ascii="Cambria Math" w:eastAsia="Times New Roman" w:hAnsi="Cambria Math" w:cs="Arial"/>
                 <w:i/>
+                <w:kern w:val="0"/>
                 <w:lang w:eastAsia="en-CA"/>
+                <w14:ligatures w14:val="none"/>
               </w:rPr>
             </m:ctrlPr>
           </m:dPr>
@@ -940,17 +984,21 @@
               <m:sSubPr>
                 <m:ctrlPr>
                   <w:rPr>
-                    <w:rFonts w:ascii="Cambria Math" w:hAnsi="Cambria Math"/>
+                    <w:rFonts w:ascii="Cambria Math" w:eastAsia="Times New Roman" w:hAnsi="Cambria Math" w:cs="Arial"/>
                     <w:i/>
+                    <w:kern w:val="0"/>
                     <w:lang w:eastAsia="en-CA"/>
+                    <w14:ligatures w14:val="none"/>
                   </w:rPr>
                 </m:ctrlPr>
               </m:sSubPr>
               <m:e>
                 <m:r>
                   <w:rPr>
-                    <w:rFonts w:ascii="Cambria Math" w:hAnsi="Cambria Math"/>
+                    <w:rFonts w:ascii="Cambria Math" w:eastAsia="Times New Roman" w:hAnsi="Cambria Math" w:cs="Arial"/>
+                    <w:kern w:val="0"/>
                     <w:lang w:eastAsia="en-CA"/>
+                    <w14:ligatures w14:val="none"/>
                   </w:rPr>
                   <m:t>k</m:t>
                 </m:r>
@@ -958,8 +1006,10 @@
               <m:sub>
                 <m:r>
                   <w:rPr>
-                    <w:rFonts w:ascii="Cambria Math" w:hAnsi="Cambria Math"/>
+                    <w:rFonts w:ascii="Cambria Math" w:eastAsia="Times New Roman" w:hAnsi="Cambria Math" w:cs="Arial"/>
+                    <w:kern w:val="0"/>
                     <w:lang w:eastAsia="en-CA"/>
+                    <w14:ligatures w14:val="none"/>
                   </w:rPr>
                   <m:t>0</m:t>
                 </m:r>
@@ -967,8 +1017,10 @@
             </m:sSub>
             <m:r>
               <w:rPr>
-                <w:rFonts w:ascii="Cambria Math" w:hAnsi="Cambria Math"/>
+                <w:rFonts w:ascii="Cambria Math" w:eastAsia="Times New Roman" w:hAnsi="Cambria Math" w:cs="Arial"/>
+                <w:kern w:val="0"/>
                 <w:lang w:eastAsia="en-CA"/>
+                <w14:ligatures w14:val="none"/>
               </w:rPr>
               <m:t>,</m:t>
             </m:r>
@@ -976,17 +1028,21 @@
               <m:sSubPr>
                 <m:ctrlPr>
                   <w:rPr>
-                    <w:rFonts w:ascii="Cambria Math" w:hAnsi="Cambria Math"/>
+                    <w:rFonts w:ascii="Cambria Math" w:eastAsia="Times New Roman" w:hAnsi="Cambria Math" w:cs="Arial"/>
                     <w:i/>
+                    <w:kern w:val="0"/>
                     <w:lang w:eastAsia="en-CA"/>
+                    <w14:ligatures w14:val="none"/>
                   </w:rPr>
                 </m:ctrlPr>
               </m:sSubPr>
               <m:e>
                 <m:r>
                   <w:rPr>
-                    <w:rFonts w:ascii="Cambria Math" w:hAnsi="Cambria Math"/>
+                    <w:rFonts w:ascii="Cambria Math" w:eastAsia="Times New Roman" w:hAnsi="Cambria Math" w:cs="Arial"/>
+                    <w:kern w:val="0"/>
                     <w:lang w:eastAsia="en-CA"/>
+                    <w14:ligatures w14:val="none"/>
                   </w:rPr>
                   <m:t>k</m:t>
                 </m:r>
@@ -994,8 +1050,10 @@
               <m:sub>
                 <m:r>
                   <w:rPr>
-                    <w:rFonts w:ascii="Cambria Math" w:hAnsi="Cambria Math"/>
+                    <w:rFonts w:ascii="Cambria Math" w:eastAsia="Times New Roman" w:hAnsi="Cambria Math" w:cs="Arial"/>
+                    <w:kern w:val="0"/>
                     <w:lang w:eastAsia="en-CA"/>
+                    <w14:ligatures w14:val="none"/>
                   </w:rPr>
                   <m:t>1</m:t>
                 </m:r>
@@ -1003,8 +1061,10 @@
             </m:sSub>
             <m:r>
               <w:rPr>
-                <w:rFonts w:ascii="Cambria Math" w:hAnsi="Cambria Math"/>
+                <w:rFonts w:ascii="Cambria Math" w:eastAsia="Times New Roman" w:hAnsi="Cambria Math" w:cs="Arial"/>
+                <w:kern w:val="0"/>
                 <w:lang w:eastAsia="en-CA"/>
+                <w14:ligatures w14:val="none"/>
               </w:rPr>
               <m:t>,</m:t>
             </m:r>
@@ -1012,17 +1072,21 @@
               <m:sSubPr>
                 <m:ctrlPr>
                   <w:rPr>
-                    <w:rFonts w:ascii="Cambria Math" w:hAnsi="Cambria Math"/>
+                    <w:rFonts w:ascii="Cambria Math" w:eastAsia="Times New Roman" w:hAnsi="Cambria Math" w:cs="Arial"/>
                     <w:i/>
+                    <w:kern w:val="0"/>
                     <w:lang w:eastAsia="en-CA"/>
+                    <w14:ligatures w14:val="none"/>
                   </w:rPr>
                 </m:ctrlPr>
               </m:sSubPr>
               <m:e>
                 <m:r>
                   <w:rPr>
-                    <w:rFonts w:ascii="Cambria Math" w:hAnsi="Cambria Math"/>
+                    <w:rFonts w:ascii="Cambria Math" w:eastAsia="Times New Roman" w:hAnsi="Cambria Math" w:cs="Arial"/>
+                    <w:kern w:val="0"/>
                     <w:lang w:eastAsia="en-CA"/>
+                    <w14:ligatures w14:val="none"/>
                   </w:rPr>
                   <m:t>k</m:t>
                 </m:r>
@@ -1030,8 +1094,10 @@
               <m:sub>
                 <m:r>
                   <w:rPr>
-                    <w:rFonts w:ascii="Cambria Math" w:hAnsi="Cambria Math"/>
+                    <w:rFonts w:ascii="Cambria Math" w:eastAsia="Times New Roman" w:hAnsi="Cambria Math" w:cs="Arial"/>
+                    <w:kern w:val="0"/>
                     <w:lang w:eastAsia="en-CA"/>
+                    <w14:ligatures w14:val="none"/>
                   </w:rPr>
                   <m:t>2</m:t>
                 </m:r>
@@ -1042,22 +1108,30 @@
       </m:oMath>
       <w:r>
         <w:rPr>
+          <w:rFonts w:ascii="Arial" w:eastAsia="Times New Roman" w:hAnsi="Arial" w:cs="Arial"/>
+          <w:kern w:val="0"/>
           <w:lang w:eastAsia="en-CA"/>
+          <w14:ligatures w14:val="none"/>
         </w:rPr>
         <w:t xml:space="preserve">. Un pointeur d'indexation </w:t>
       </w:r>
       <m:oMath>
         <m:r>
           <w:rPr>
-            <w:rFonts w:ascii="Cambria Math" w:hAnsi="Cambria Math"/>
+            <w:rFonts w:ascii="Cambria Math" w:eastAsia="Times New Roman" w:hAnsi="Cambria Math" w:cs="Arial"/>
+            <w:kern w:val="0"/>
             <w:lang w:eastAsia="en-CA"/>
+            <w14:ligatures w14:val="none"/>
           </w:rPr>
           <m:t>j</m:t>
         </m:r>
       </m:oMath>
       <w:r>
         <w:rPr>
+          <w:rFonts w:ascii="Arial" w:eastAsia="Times New Roman" w:hAnsi="Arial" w:cs="Arial"/>
+          <w:kern w:val="0"/>
           <w:lang w:eastAsia="en-CA"/>
+          <w14:ligatures w14:val="none"/>
         </w:rPr>
         <w:t>, synchronisé uniquement sur les caractères alphabétiques traités, évolue selon la règle récursive :</w:t>
       </w:r>
@@ -1149,7 +1223,7 @@
               <w:lang w:val="en-CA" w:eastAsia="en-CA"/>
               <w14:ligatures w14:val="none"/>
             </w:rPr>
-            <m:t>\pmod3</m:t>
+            <m:t xml:space="preserve"> mod 3</m:t>
           </m:r>
         </m:oMath>
       </m:oMathPara>
@@ -1168,11 +1242,7 @@
     </w:p>
     <w:p>
       <w:r>
-        <w:t xml:space="preserve">L'attaque par force brute consiste à explorer l'espace des clés de manière exhaustive. Pour César, la dimension spatiale est restreinte (N = 26). Pour Enigma César, l'espace croît de </w:t>
-      </w:r>
-      <w:r>
-        <w:lastRenderedPageBreak/>
-        <w:t xml:space="preserve">façon combinatoire à </w:t>
+        <w:t xml:space="preserve">L'attaque par force brute consiste à explorer l'espace des clés de manière exhaustive. Pour César, la dimension spatiale est restreinte (N = 26). Pour Enigma César, l'espace croît de façon combinatoire à </w:t>
       </w:r>
       <m:oMath>
         <m:r>
@@ -1229,78 +1299,167 @@
     </w:p>
     <w:p>
       <w:r>
-        <w:t xml:space="preserve">Heuristique de Détection Automatique (Filtrage) : Pour identifier la bonne clé sans intervention humaine, la fonction </w:t>
+        <w:lastRenderedPageBreak/>
+        <w:t>Heuristique de Détection Automatique (Filtrage)</w:t>
+      </w:r>
+      <w:r>
+        <w:rPr>
+          <w:b/>
+          <w:bCs/>
+        </w:rPr>
+        <w:t xml:space="preserve"> :</w:t>
+      </w:r>
+      <w:r>
+        <w:t xml:space="preserve"> Pour identifier la bonne clé sans intervention humaine, le programme extrait les mots avec l'expression régulière </w:t>
       </w:r>
       <w:r>
         <w:rPr>
           <w:rFonts w:ascii="Courier New" w:hAnsi="Courier New" w:cs="Courier New"/>
         </w:rPr>
-        <w:t>est_francais</w:t>
-      </w:r>
-      <w:r>
-        <w:t xml:space="preserve"> analyse la pertinence sémantique du texte partiel produit. Elle extrait les chaînes de caractères pures à l'aide d'expressions régulières </w:t>
+        <w:t xml:space="preserve">stricte </w:t>
       </w:r>
       <w:proofErr w:type="gramStart"/>
       <w:r>
         <w:rPr>
           <w:rFonts w:ascii="Courier New" w:hAnsi="Courier New" w:cs="Courier New"/>
         </w:rPr>
-        <w:t>( re</w:t>
+        <w:t xml:space="preserve">( </w:t>
+      </w:r>
+      <w:proofErr w:type="spellStart"/>
+      <w:r>
+        <w:rPr>
+          <w:rFonts w:ascii="Courier New" w:hAnsi="Courier New" w:cs="Courier New"/>
+        </w:rPr>
+        <w:t>re</w:t>
       </w:r>
       <w:proofErr w:type="gramEnd"/>
       <w:r>
         <w:rPr>
           <w:rFonts w:ascii="Courier New" w:hAnsi="Courier New" w:cs="Courier New"/>
         </w:rPr>
-        <w:t>.</w:t>
+        <w:t>.findall</w:t>
+      </w:r>
+      <w:proofErr w:type="spellEnd"/>
+      <w:r>
+        <w:rPr>
+          <w:rFonts w:ascii="Courier New" w:hAnsi="Courier New" w:cs="Courier New"/>
+        </w:rPr>
+        <w:t>(r'\b[a-</w:t>
       </w:r>
       <w:proofErr w:type="gramStart"/>
       <w:r>
         <w:rPr>
           <w:rFonts w:ascii="Courier New" w:hAnsi="Courier New" w:cs="Courier New"/>
         </w:rPr>
-        <w:t>findall(</w:t>
+        <w:t>z]+</w:t>
       </w:r>
       <w:proofErr w:type="gramEnd"/>
       <w:r>
         <w:rPr>
           <w:rFonts w:ascii="Courier New" w:hAnsi="Courier New" w:cs="Courier New"/>
         </w:rPr>
-        <w:t>r' [a-</w:t>
+        <w:t>\b', texte</w:t>
       </w:r>
       <w:proofErr w:type="gramStart"/>
       <w:r>
         <w:rPr>
           <w:rFonts w:ascii="Courier New" w:hAnsi="Courier New" w:cs="Courier New"/>
         </w:rPr>
-        <w:t>z]+</w:t>
+        <w:t>) )</w:t>
       </w:r>
       <w:proofErr w:type="gramEnd"/>
       <w:r>
+        <w:t xml:space="preserve"> basée sur les limites de mots (</w:t>
+      </w:r>
+      <w:proofErr w:type="spellStart"/>
+      <w:r>
+        <w:t>word</w:t>
+      </w:r>
+      <w:proofErr w:type="spellEnd"/>
+      <w:r>
+        <w:t xml:space="preserve"> </w:t>
+      </w:r>
+      <w:proofErr w:type="spellStart"/>
+      <w:r>
+        <w:t>boundaries</w:t>
+      </w:r>
+      <w:proofErr w:type="spellEnd"/>
+      <w:r>
+        <w:t xml:space="preserve">). Il comptabilise ensuite les correspondances avec un dictionnaire étendu contenant près de 60 mots courants français. Pour le chiffrement de César, une limite dynamique </w:t>
+      </w:r>
+      <w:proofErr w:type="gramStart"/>
+      <w:r>
         <w:rPr>
           <w:rFonts w:ascii="Courier New" w:hAnsi="Courier New" w:cs="Courier New"/>
         </w:rPr>
-        <w:t xml:space="preserve"> ', texte</w:t>
-      </w:r>
+        <w:t>max(</w:t>
+      </w:r>
+      <w:proofErr w:type="gramEnd"/>
+      <w:r>
+        <w:rPr>
+          <w:rFonts w:ascii="Courier New" w:hAnsi="Courier New" w:cs="Courier New"/>
+        </w:rPr>
+        <w:t xml:space="preserve">3, </w:t>
+      </w:r>
+      <w:proofErr w:type="spellStart"/>
       <w:proofErr w:type="gramStart"/>
       <w:r>
         <w:rPr>
           <w:rFonts w:ascii="Courier New" w:hAnsi="Courier New" w:cs="Courier New"/>
         </w:rPr>
-        <w:t>) )</w:t>
-      </w:r>
+        <w:t>int</w:t>
+      </w:r>
+      <w:proofErr w:type="spellEnd"/>
+      <w:r>
+        <w:rPr>
+          <w:rFonts w:ascii="Courier New" w:hAnsi="Courier New" w:cs="Courier New"/>
+        </w:rPr>
+        <w:t>(</w:t>
+      </w:r>
+      <w:proofErr w:type="spellStart"/>
       <w:proofErr w:type="gramEnd"/>
       <w:r>
-        <w:t xml:space="preserve"> et comptabilise les correspondances avec un dictionnaire de mots fonctionnels francophones hautement fréquents (le, la, les,</w:t>
-      </w:r>
-      <w:r>
-        <w:t xml:space="preserve"> </w:t>
-      </w:r>
-      <w:r>
-        <w:t>et, de, du, un, une, est, que, dans, pour).</w:t>
-      </w:r>
-      <w:r>
-        <w:t xml:space="preserve"> </w:t>
+        <w:rPr>
+          <w:rFonts w:ascii="Courier New" w:hAnsi="Courier New" w:cs="Courier New"/>
+        </w:rPr>
+        <w:t>total_mots</w:t>
+      </w:r>
+      <w:proofErr w:type="spellEnd"/>
+      <w:r>
+        <w:rPr>
+          <w:rFonts w:ascii="Courier New" w:hAnsi="Courier New" w:cs="Courier New"/>
+        </w:rPr>
+        <w:t xml:space="preserve"> / 4.5))</w:t>
+      </w:r>
+      <w:r>
+        <w:t xml:space="preserve"> est utilisée afin de s'adapter automatiquement à la longueur du texte.</w:t>
+      </w:r>
+    </w:p>
+    <w:p>
+      <w:r>
+        <w:t xml:space="preserve">Évaluation Exhaustive pour Enigma : Contrairement à César qui s'arrête au premier succès, la fonction </w:t>
+      </w:r>
+      <w:proofErr w:type="spellStart"/>
+      <w:r>
+        <w:rPr>
+          <w:rFonts w:ascii="Courier New" w:hAnsi="Courier New" w:cs="Courier New"/>
+        </w:rPr>
+        <w:t>brute_force_enigma</w:t>
+      </w:r>
+      <w:proofErr w:type="spellEnd"/>
+      <w:r>
+        <w:t xml:space="preserve"> évalue la totalité des 17 576 combinaisons. Elle attribue un ratio de mots français (</w:t>
+      </w:r>
+      <w:proofErr w:type="spellStart"/>
+      <w:r>
+        <w:rPr>
+          <w:rFonts w:ascii="Courier New" w:hAnsi="Courier New" w:cs="Courier New"/>
+        </w:rPr>
+        <w:t>score_francais</w:t>
+      </w:r>
+      <w:proofErr w:type="spellEnd"/>
+      <w:r>
+        <w:t>) à chaque essai et retourne uniquement la clé ayant obtenu le meilleur score absolu (avec un seuil de validation minimum de 0.15, soit 15%), éliminant ainsi complètement les faux positifs.</w:t>
       </w:r>
     </w:p>
     <w:p>
@@ -1454,8 +1613,8 @@
       <w:tblGrid>
         <w:gridCol w:w="2337"/>
         <w:gridCol w:w="2337"/>
-        <w:gridCol w:w="2338"/>
-        <w:gridCol w:w="2338"/>
+        <w:gridCol w:w="2251"/>
+        <w:gridCol w:w="2425"/>
       </w:tblGrid>
       <w:tr>
         <w:trPr>
@@ -1532,7 +1691,7 @@
         </w:tc>
         <w:tc>
           <w:tcPr>
-            <w:tcW w:w="2338" w:type="dxa"/>
+            <w:tcW w:w="2251" w:type="dxa"/>
           </w:tcPr>
           <w:p>
             <w:pPr>
@@ -1568,7 +1727,7 @@
         </w:tc>
         <w:tc>
           <w:tcPr>
-            <w:tcW w:w="2338" w:type="dxa"/>
+            <w:tcW w:w="2425" w:type="dxa"/>
           </w:tcPr>
           <w:p>
             <w:pPr>
@@ -1641,7 +1800,7 @@
         </w:tc>
         <w:tc>
           <w:tcPr>
-            <w:tcW w:w="2338" w:type="dxa"/>
+            <w:tcW w:w="2251" w:type="dxa"/>
           </w:tcPr>
           <w:p>
             <w:pPr>
@@ -1662,7 +1821,7 @@
         </w:tc>
         <w:tc>
           <w:tcPr>
-            <w:tcW w:w="2338" w:type="dxa"/>
+            <w:tcW w:w="2425" w:type="dxa"/>
           </w:tcPr>
           <w:p>
             <w:pPr>
@@ -1722,7 +1881,7 @@
         </w:tc>
         <w:tc>
           <w:tcPr>
-            <w:tcW w:w="2338" w:type="dxa"/>
+            <w:tcW w:w="2251" w:type="dxa"/>
           </w:tcPr>
           <w:p>
             <w:pPr>
@@ -1775,7 +1934,7 @@
         </w:tc>
         <w:tc>
           <w:tcPr>
-            <w:tcW w:w="2338" w:type="dxa"/>
+            <w:tcW w:w="2425" w:type="dxa"/>
           </w:tcPr>
           <w:p>
             <w:pPr>
@@ -1786,17 +1945,35 @@
               <w:rPr>
                 <w:lang w:val="en-CA"/>
               </w:rPr>
-              <w:t>Succès (Seuil ≥ 3)</w:t>
+              <w:t>Succès (</w:t>
+            </w:r>
+            <w:proofErr w:type="spellStart"/>
+            <w:r>
+              <w:rPr>
+                <w:lang w:val="en-CA"/>
+              </w:rPr>
+              <w:t>Seuil</w:t>
+            </w:r>
+            <w:proofErr w:type="spellEnd"/>
+            <w:r>
+              <w:rPr>
+                <w:lang w:val="en-CA"/>
+              </w:rPr>
+              <w:t xml:space="preserve"> ≥ </w:t>
+            </w:r>
+            <w:r>
+              <w:t>0.15</w:t>
+            </w:r>
+            <w:r>
+              <w:rPr>
+                <w:lang w:val="en-CA"/>
+              </w:rPr>
+              <w:t>)</w:t>
             </w:r>
           </w:p>
         </w:tc>
       </w:tr>
     </w:tbl>
-    <w:p>
-      <w:pPr>
-        <w:pStyle w:val="Titre2"/>
-      </w:pPr>
-    </w:p>
     <w:p>
       <w:pPr>
         <w:pStyle w:val="Titre2"/>
@@ -2065,7 +2242,6 @@
       </w:tr>
     </w:tbl>
     <w:p/>
-    <w:p/>
     <w:sectPr>
       <w:pgSz w:w="12240" w:h="15840"/>
       <w:pgMar w:top="720" w:right="1440" w:bottom="810" w:left="1440" w:header="708" w:footer="708" w:gutter="0"/>
@@ -2504,6 +2680,155 @@
     </w:lvl>
   </w:abstractNum>
   <w:abstractNum w:abstractNumId="4" w15:restartNumberingAfterBreak="0">
+    <w:nsid w:val="516E3FED"/>
+    <w:multiLevelType w:val="multilevel"/>
+    <w:tmpl w:val="5310E194"/>
+    <w:lvl w:ilvl="0">
+      <w:start w:val="1"/>
+      <w:numFmt w:val="bullet"/>
+      <w:lvlText w:val=""/>
+      <w:lvlJc w:val="left"/>
+      <w:pPr>
+        <w:tabs>
+          <w:tab w:val="num" w:pos="720"/>
+        </w:tabs>
+        <w:ind w:left="720" w:hanging="360"/>
+      </w:pPr>
+      <w:rPr>
+        <w:rFonts w:ascii="Symbol" w:hAnsi="Symbol" w:hint="default"/>
+        <w:sz w:val="20"/>
+      </w:rPr>
+    </w:lvl>
+    <w:lvl w:ilvl="1" w:tentative="1">
+      <w:start w:val="1"/>
+      <w:numFmt w:val="bullet"/>
+      <w:lvlText w:val="o"/>
+      <w:lvlJc w:val="left"/>
+      <w:pPr>
+        <w:tabs>
+          <w:tab w:val="num" w:pos="1440"/>
+        </w:tabs>
+        <w:ind w:left="1440" w:hanging="360"/>
+      </w:pPr>
+      <w:rPr>
+        <w:rFonts w:ascii="Courier New" w:hAnsi="Courier New" w:hint="default"/>
+        <w:sz w:val="20"/>
+      </w:rPr>
+    </w:lvl>
+    <w:lvl w:ilvl="2" w:tentative="1">
+      <w:start w:val="1"/>
+      <w:numFmt w:val="bullet"/>
+      <w:lvlText w:val=""/>
+      <w:lvlJc w:val="left"/>
+      <w:pPr>
+        <w:tabs>
+          <w:tab w:val="num" w:pos="2160"/>
+        </w:tabs>
+        <w:ind w:left="2160" w:hanging="360"/>
+      </w:pPr>
+      <w:rPr>
+        <w:rFonts w:ascii="Wingdings" w:hAnsi="Wingdings" w:hint="default"/>
+        <w:sz w:val="20"/>
+      </w:rPr>
+    </w:lvl>
+    <w:lvl w:ilvl="3" w:tentative="1">
+      <w:start w:val="1"/>
+      <w:numFmt w:val="bullet"/>
+      <w:lvlText w:val=""/>
+      <w:lvlJc w:val="left"/>
+      <w:pPr>
+        <w:tabs>
+          <w:tab w:val="num" w:pos="2880"/>
+        </w:tabs>
+        <w:ind w:left="2880" w:hanging="360"/>
+      </w:pPr>
+      <w:rPr>
+        <w:rFonts w:ascii="Wingdings" w:hAnsi="Wingdings" w:hint="default"/>
+        <w:sz w:val="20"/>
+      </w:rPr>
+    </w:lvl>
+    <w:lvl w:ilvl="4" w:tentative="1">
+      <w:start w:val="1"/>
+      <w:numFmt w:val="bullet"/>
+      <w:lvlText w:val=""/>
+      <w:lvlJc w:val="left"/>
+      <w:pPr>
+        <w:tabs>
+          <w:tab w:val="num" w:pos="3600"/>
+        </w:tabs>
+        <w:ind w:left="3600" w:hanging="360"/>
+      </w:pPr>
+      <w:rPr>
+        <w:rFonts w:ascii="Wingdings" w:hAnsi="Wingdings" w:hint="default"/>
+        <w:sz w:val="20"/>
+      </w:rPr>
+    </w:lvl>
+    <w:lvl w:ilvl="5" w:tentative="1">
+      <w:start w:val="1"/>
+      <w:numFmt w:val="bullet"/>
+      <w:lvlText w:val=""/>
+      <w:lvlJc w:val="left"/>
+      <w:pPr>
+        <w:tabs>
+          <w:tab w:val="num" w:pos="4320"/>
+        </w:tabs>
+        <w:ind w:left="4320" w:hanging="360"/>
+      </w:pPr>
+      <w:rPr>
+        <w:rFonts w:ascii="Wingdings" w:hAnsi="Wingdings" w:hint="default"/>
+        <w:sz w:val="20"/>
+      </w:rPr>
+    </w:lvl>
+    <w:lvl w:ilvl="6" w:tentative="1">
+      <w:start w:val="1"/>
+      <w:numFmt w:val="bullet"/>
+      <w:lvlText w:val=""/>
+      <w:lvlJc w:val="left"/>
+      <w:pPr>
+        <w:tabs>
+          <w:tab w:val="num" w:pos="5040"/>
+        </w:tabs>
+        <w:ind w:left="5040" w:hanging="360"/>
+      </w:pPr>
+      <w:rPr>
+        <w:rFonts w:ascii="Wingdings" w:hAnsi="Wingdings" w:hint="default"/>
+        <w:sz w:val="20"/>
+      </w:rPr>
+    </w:lvl>
+    <w:lvl w:ilvl="7" w:tentative="1">
+      <w:start w:val="1"/>
+      <w:numFmt w:val="bullet"/>
+      <w:lvlText w:val=""/>
+      <w:lvlJc w:val="left"/>
+      <w:pPr>
+        <w:tabs>
+          <w:tab w:val="num" w:pos="5760"/>
+        </w:tabs>
+        <w:ind w:left="5760" w:hanging="360"/>
+      </w:pPr>
+      <w:rPr>
+        <w:rFonts w:ascii="Wingdings" w:hAnsi="Wingdings" w:hint="default"/>
+        <w:sz w:val="20"/>
+      </w:rPr>
+    </w:lvl>
+    <w:lvl w:ilvl="8" w:tentative="1">
+      <w:start w:val="1"/>
+      <w:numFmt w:val="bullet"/>
+      <w:lvlText w:val=""/>
+      <w:lvlJc w:val="left"/>
+      <w:pPr>
+        <w:tabs>
+          <w:tab w:val="num" w:pos="6480"/>
+        </w:tabs>
+        <w:ind w:left="6480" w:hanging="360"/>
+      </w:pPr>
+      <w:rPr>
+        <w:rFonts w:ascii="Wingdings" w:hAnsi="Wingdings" w:hint="default"/>
+        <w:sz w:val="20"/>
+      </w:rPr>
+    </w:lvl>
+  </w:abstractNum>
+  <w:abstractNum w:abstractNumId="5" w15:restartNumberingAfterBreak="0">
     <w:nsid w:val="53077C4F"/>
     <w:multiLevelType w:val="hybridMultilevel"/>
     <w:tmpl w:val="8166AAFA"/>
@@ -2589,7 +2914,7 @@
       </w:pPr>
     </w:lvl>
   </w:abstractNum>
-  <w:abstractNum w:abstractNumId="5" w15:restartNumberingAfterBreak="0">
+  <w:abstractNum w:abstractNumId="6" w15:restartNumberingAfterBreak="0">
     <w:nsid w:val="5B837728"/>
     <w:multiLevelType w:val="hybridMultilevel"/>
     <w:tmpl w:val="2E82974A"/>
@@ -2678,7 +3003,7 @@
       </w:pPr>
     </w:lvl>
   </w:abstractNum>
-  <w:abstractNum w:abstractNumId="6" w15:restartNumberingAfterBreak="0">
+  <w:abstractNum w:abstractNumId="7" w15:restartNumberingAfterBreak="0">
     <w:nsid w:val="60334C0D"/>
     <w:multiLevelType w:val="hybridMultilevel"/>
     <w:tmpl w:val="75F6C116"/>
@@ -2791,7 +3116,7 @@
       </w:rPr>
     </w:lvl>
   </w:abstractNum>
-  <w:abstractNum w:abstractNumId="7" w15:restartNumberingAfterBreak="0">
+  <w:abstractNum w:abstractNumId="8" w15:restartNumberingAfterBreak="0">
     <w:nsid w:val="65EB3B00"/>
     <w:multiLevelType w:val="hybridMultilevel"/>
     <w:tmpl w:val="69B83A5E"/>
@@ -2904,7 +3229,7 @@
       </w:rPr>
     </w:lvl>
   </w:abstractNum>
-  <w:abstractNum w:abstractNumId="8" w15:restartNumberingAfterBreak="0">
+  <w:abstractNum w:abstractNumId="9" w15:restartNumberingAfterBreak="0">
     <w:nsid w:val="715218DE"/>
     <w:multiLevelType w:val="hybridMultilevel"/>
     <w:tmpl w:val="00DEA67E"/>
@@ -3018,16 +3343,16 @@
     </w:lvl>
   </w:abstractNum>
   <w:num w:numId="1" w16cid:durableId="577128923">
-    <w:abstractNumId w:val="5"/>
+    <w:abstractNumId w:val="6"/>
   </w:num>
   <w:num w:numId="2" w16cid:durableId="118687242">
-    <w:abstractNumId w:val="4"/>
+    <w:abstractNumId w:val="5"/>
   </w:num>
   <w:num w:numId="3" w16cid:durableId="1580752419">
     <w:abstractNumId w:val="0"/>
   </w:num>
   <w:num w:numId="4" w16cid:durableId="70858190">
-    <w:abstractNumId w:val="8"/>
+    <w:abstractNumId w:val="9"/>
   </w:num>
   <w:num w:numId="5" w16cid:durableId="207954566">
     <w:abstractNumId w:val="2"/>
@@ -3036,13 +3361,16 @@
     <w:abstractNumId w:val="3"/>
   </w:num>
   <w:num w:numId="7" w16cid:durableId="2041006907">
-    <w:abstractNumId w:val="7"/>
+    <w:abstractNumId w:val="8"/>
   </w:num>
   <w:num w:numId="8" w16cid:durableId="2138911047">
     <w:abstractNumId w:val="1"/>
   </w:num>
   <w:num w:numId="9" w16cid:durableId="698092233">
-    <w:abstractNumId w:val="6"/>
+    <w:abstractNumId w:val="7"/>
+  </w:num>
+  <w:num w:numId="10" w16cid:durableId="1201210008">
+    <w:abstractNumId w:val="4"/>
   </w:num>
 </w:numbering>
 </file>

</xml_diff>